<commit_message>
Update solution health review: Connectors solution, import order, export fixes
Co-Authored-By: Claude Opus 5.5 <noreply@anthropic.com>
Claude-Session: https://claude.ai/code/session_01TgBEjeuQGQ5bhWXKguSLhR
</commit_message>
<xml_diff>
--- a/solution-health/AlSanidiMarketing-Solution-Health-Review.docx
+++ b/solution-health/AlSanidiMarketing-Solution-Health-Review.docx
@@ -447,7 +447,7 @@
                 <w:sz w:val="18"/>
                 <w:szCs w:val="18"/>
               </w:rPr>
-              <w:t xml:space="preserve">150</w:t>
+              <w:t xml:space="preserve">146 (plus 4 connectors in AlSanidi | Marketing | Connectors)</w:t>
             </w:r>
           </w:p>
         </w:tc>
@@ -466,7 +466,7 @@
         <w:spacing w:after="120"/>
       </w:pPr>
       <w:r>
-        <w:t xml:space="preserve">The solution was reviewed for component health and Power Platform design best practices: connections, connectors, environment variables, flows, tables, web resources and dependencies. Two findings were fixed in UAT before export; the remaining findings are planned for future deployments.</w:t>
+        <w:t xml:space="preserve">The solution was reviewed for component health and Power Platform design best practices: connections, connectors, environment variables, flows, tables, web resources and dependencies. Two findings were fixed in UAT before export; the remaining findings are planned for future deployments. Two more issues found during export were also fixed (section 3.5).</w:t>
       </w:r>
     </w:p>
     <w:p>
@@ -546,7 +546,27 @@
         <w:t xml:space="preserve">Missing dependencies: </w:t>
       </w:r>
       <w:r>
-        <w:t xml:space="preserve">5, all on tables that already exist in Production (see section 4).</w:t>
+        <w:t xml:space="preserve">all required components exist in Production (see section 4).</w:t>
+      </w:r>
+    </w:p>
+    <w:p>
+      <w:pPr>
+        <w:pStyle w:val="ListParagraph"/>
+        <w:numPr>
+          <w:ilvl w:val="0"/>
+          <w:numId w:val="2"/>
+        </w:numPr>
+        <w:spacing w:after="60"/>
+      </w:pPr>
+      <w:r>
+        <w:rPr>
+          <w:b/>
+          <w:bCs/>
+        </w:rPr>
+        <w:t xml:space="preserve">Managed packages: </w:t>
+      </w:r>
+      <w:r>
+        <w:t xml:space="preserve">both solutions export as managed and contain no secrets or UAT URLs.</w:t>
       </w:r>
     </w:p>
     <w:p>
@@ -2607,7 +2627,34 @@
         <w:pStyle w:val="Heading2"/>
       </w:pPr>
       <w:r>
-        <w:t xml:space="preserve">3.4 Other</w:t>
+        <w:t xml:space="preserve">3.4 New solution: AlSanidi | Marketing | Connectors</w:t>
+      </w:r>
+    </w:p>
+    <w:p>
+      <w:pPr>
+        <w:spacing w:after="120"/>
+      </w:pPr>
+      <w:r>
+        <w:t xml:space="preserve">Unique name </w:t>
+      </w:r>
+      <w:r>
+        <w:rPr>
+          <w:rFonts w:ascii="Consolas" w:cs="Consolas" w:eastAsia="Consolas" w:hAnsi="Consolas"/>
+          <w:sz w:val="18"/>
+          <w:szCs w:val="18"/>
+        </w:rPr>
+        <w:t xml:space="preserve">AlSanidiMarketingConnectors</w:t>
+      </w:r>
+      <w:r>
+        <w:t xml:space="preserve">, version 1.0.0, publisher AlSanidi Development. Holds the 4 custom connectors (Meta, Snap, TikTok, Google Ads), moved out of AlSanidi | Marketing. Microsoft requires custom connectors to be imported in a separate solution before the connection references and flows that use them.</w:t>
+      </w:r>
+    </w:p>
+    <w:p>
+      <w:pPr>
+        <w:pStyle w:val="Heading2"/>
+      </w:pPr>
+      <w:r>
+        <w:t xml:space="preserve">3.5 Fixes found during export</w:t>
       </w:r>
     </w:p>
     <w:p>
@@ -2620,7 +2667,14 @@
         <w:spacing w:after="60"/>
       </w:pPr>
       <w:r>
-        <w:t xml:space="preserve">Business rule 'New business rule' on Advertisement Item renamed to 'Show/Hide Product or Category by Item Type'.</w:t>
+        <w:rPr>
+          <w:b/>
+          <w:bCs/>
+        </w:rPr>
+        <w:t xml:space="preserve">TikTok connection reference: </w:t>
+      </w:r>
+      <w:r>
+        <w:t xml:space="preserve">its link to the TikTok connector record (customconnectorid) was empty, which blocked the export. Linked it. A TikTok connection was also created and bound in UAT.</w:t>
       </w:r>
     </w:p>
     <w:p>
@@ -2633,6 +2687,47 @@
         <w:spacing w:after="60"/>
       </w:pPr>
       <w:r>
+        <w:rPr>
+          <w:b/>
+          <w:bCs/>
+        </w:rPr>
+        <w:t xml:space="preserve">Google Ads secrets inside flows: </w:t>
+      </w:r>
+      <w:r>
+        <w:t xml:space="preserve">Get Google Ads Campaigns, Get Google Ads Ad Groups and Get Google Ads Advertisements held saved copies of the environment variable values (client ID, client secret, refresh token, developer token, customer IDs) in their definitions. Cleared them; the flows read the environment variables at run time. Rotate the Google Ads credentials.</w:t>
+      </w:r>
+    </w:p>
+    <w:p>
+      <w:pPr>
+        <w:pStyle w:val="Heading2"/>
+      </w:pPr>
+      <w:r>
+        <w:t xml:space="preserve">3.6 Other</w:t>
+      </w:r>
+    </w:p>
+    <w:p>
+      <w:pPr>
+        <w:pStyle w:val="ListParagraph"/>
+        <w:numPr>
+          <w:ilvl w:val="0"/>
+          <w:numId w:val="2"/>
+        </w:numPr>
+        <w:spacing w:after="60"/>
+      </w:pPr>
+      <w:r>
+        <w:t xml:space="preserve">Business rule 'New business rule' on Advertisement Item renamed to 'Show/Hide Product or Category by Item Type'.</w:t>
+      </w:r>
+    </w:p>
+    <w:p>
+      <w:pPr>
+        <w:pStyle w:val="ListParagraph"/>
+        <w:numPr>
+          <w:ilvl w:val="0"/>
+          <w:numId w:val="2"/>
+        </w:numPr>
+        <w:spacing w:after="60"/>
+      </w:pPr>
+      <w:r>
         <w:t xml:space="preserve">Related components outside the scope of Marketing that already exist in Production were removed from the solution by the team (Product, City, Product Category and related forms).</w:t>
       </w:r>
     </w:p>
@@ -2649,7 +2744,7 @@
         <w:spacing w:after="120"/>
       </w:pPr>
       <w:r>
-        <w:t xml:space="preserve">AlSanidi | Marketing needs these components in Production before import:</w:t>
+        <w:t xml:space="preserve">AlSanidi | Marketing needs these components in Production before import. All were confirmed in Production on 25 October 2026. The 4 custom connectors come from AlSanidi | Marketing | Connectors; the Microsoft components it also needs (product, flowrun, appnotification, controls, app icon) are installed.</w:t>
       </w:r>
     </w:p>
     <w:tbl>
@@ -3033,26 +3128,33 @@
           <w:b/>
           <w:bCs/>
         </w:rPr>
-        <w:t xml:space="preserve">Check: </w:t>
-      </w:r>
-      <w:r>
-        <w:t xml:space="preserve">tables and columns are matched by name, but the view is matched by ID. Confirm the view exists in Production with the same ID: </w:t>
-      </w:r>
+        <w:t xml:space="preserve">Checked: </w:t>
+      </w:r>
+      <w:r>
+        <w:t xml:space="preserve">the 'Active Product Category' view exists in Production with the same ID. Two Microsoft solutions are older in Production than in UAT (Dynamics365SupplyChainExtended 2.3.4.367 vs 2.3.4.551; MicrosoftFlowExtensionsOnline 1.10.18.1 vs 1.10.20.1); the components needed from them exist in Production. Update them in the admin center if the import reports a version issue.</w:t>
+      </w:r>
+    </w:p>
+    <w:p>
+      <w:pPr>
+        <w:pStyle w:val="Heading1"/>
+      </w:pPr>
+      <w:r>
+        <w:t xml:space="preserve">5. Production deployment checklist</w:t>
+      </w:r>
+    </w:p>
+    <w:p>
+      <w:pPr>
+        <w:spacing w:after="120"/>
+      </w:pPr>
       <w:r>
         <w:rPr>
-          <w:rFonts w:ascii="Consolas" w:cs="Consolas" w:eastAsia="Consolas" w:hAnsi="Consolas"/>
-          <w:sz w:val="18"/>
-          <w:szCs w:val="18"/>
+          <w:b/>
+          <w:bCs/>
         </w:rPr>
-        <w:t xml:space="preserve">/api/data/v9.2/savedqueries(d109d031-490f-4d8c-99cc-f36f19223d4d)?$select=name</w:t>
-      </w:r>
-    </w:p>
-    <w:p>
-      <w:pPr>
-        <w:pStyle w:val="Heading1"/>
-      </w:pPr>
-      <w:r>
-        <w:t xml:space="preserve">5. Production deployment checklist</w:t>
+        <w:t xml:space="preserve">Import order: </w:t>
+      </w:r>
+      <w:r>
+        <w:t xml:space="preserve">1) AlSanidi | Marketing | Connectors (managed), 2) AlSanidi | Marketing (managed). Production: https://operations-alsanidi.crm4.dynamics.com.</w:t>
       </w:r>
     </w:p>
     <w:p>
@@ -3078,7 +3180,20 @@
         <w:spacing w:after="60"/>
       </w:pPr>
       <w:r>
-        <w:t xml:space="preserve">Snap: enter the OAuth client secret on the Snap connector in Production (client secrets are not exported).</w:t>
+        <w:t xml:space="preserve">Snap: after importing the Connectors solution, enter the OAuth client secret on the Snap connector in Production (client secrets are not exported).</w:t>
+      </w:r>
+    </w:p>
+    <w:p>
+      <w:pPr>
+        <w:pStyle w:val="ListParagraph"/>
+        <w:numPr>
+          <w:ilvl w:val="0"/>
+          <w:numId w:val="2"/>
+        </w:numPr>
+        <w:spacing w:after="60"/>
+      </w:pPr>
+      <w:r>
+        <w:t xml:space="preserve">Google Ads: rotate the client secret and refresh token (they were stored in flow definitions in UAT) and set the new values in the Production environment variables.</w:t>
       </w:r>
     </w:p>
     <w:p>

</xml_diff>

<commit_message>
Add Production deployment results to solution health review
Co-Authored-By: Claude Opus 5.5 <noreply@anthropic.com>
Claude-Session: https://claude.ai/code/session_01TgBEjeuQGQ5bhWXKguSLhR
</commit_message>
<xml_diff>
--- a/solution-health/AlSanidiMarketing-Solution-Health-Review.docx
+++ b/solution-health/AlSanidiMarketing-Solution-Health-Review.docx
@@ -331,7 +331,65 @@
                 <w:sz w:val="18"/>
                 <w:szCs w:val="18"/>
               </w:rPr>
-              <w:t xml:space="preserve">Managed import into Production</w:t>
+              <w:t xml:space="preserve">Production - https://operations-alsanidi.crm4.dynamics.com (managed)</w:t>
+            </w:r>
+          </w:p>
+        </w:tc>
+      </w:tr>
+      <w:tr>
+        <w:tc>
+          <w:tcPr>
+            <w:tcW w:type="dxa" w:w="2400"/>
+            <w:tcBorders>
+              <w:top w:val="single" w:color="BFBFBF" w:sz="4"/>
+              <w:left w:val="single" w:color="BFBFBF" w:sz="4"/>
+              <w:bottom w:val="single" w:color="BFBFBF" w:sz="4"/>
+              <w:right w:val="single" w:color="BFBFBF" w:sz="4"/>
+            </w:tcBorders>
+            <w:tcMar>
+              <w:top w:type="dxa" w:w="60"/>
+              <w:left w:type="dxa" w:w="100"/>
+              <w:bottom w:type="dxa" w:w="60"/>
+              <w:right w:type="dxa" w:w="100"/>
+            </w:tcMar>
+          </w:tcPr>
+          <w:p>
+            <w:r>
+              <w:rPr>
+                <w:b w:val="false"/>
+                <w:bCs w:val="false"/>
+                <w:sz w:val="18"/>
+                <w:szCs w:val="18"/>
+              </w:rPr>
+              <w:t xml:space="preserve">Deployment</w:t>
+            </w:r>
+          </w:p>
+        </w:tc>
+        <w:tc>
+          <w:tcPr>
+            <w:tcW w:type="dxa" w:w="6626"/>
+            <w:tcBorders>
+              <w:top w:val="single" w:color="BFBFBF" w:sz="4"/>
+              <w:left w:val="single" w:color="BFBFBF" w:sz="4"/>
+              <w:bottom w:val="single" w:color="BFBFBF" w:sz="4"/>
+              <w:right w:val="single" w:color="BFBFBF" w:sz="4"/>
+            </w:tcBorders>
+            <w:tcMar>
+              <w:top w:type="dxa" w:w="60"/>
+              <w:left w:type="dxa" w:w="100"/>
+              <w:bottom w:type="dxa" w:w="60"/>
+              <w:right w:type="dxa" w:w="100"/>
+            </w:tcMar>
+          </w:tcPr>
+          <w:p>
+            <w:r>
+              <w:rPr>
+                <w:b w:val="false"/>
+                <w:bCs w:val="false"/>
+                <w:sz w:val="18"/>
+                <w:szCs w:val="18"/>
+              </w:rPr>
+              <w:t xml:space="preserve">Completed 25 October 2026 - see section 6</w:t>
             </w:r>
           </w:p>
         </w:tc>
@@ -3261,6 +3319,1449 @@
         <w:t xml:space="preserve">Version: stays 1.0.0 for this deployment; bump from the next deployment.</w:t>
       </w:r>
     </w:p>
+    <w:p>
+      <w:pPr>
+        <w:pStyle w:val="Heading1"/>
+      </w:pPr>
+      <w:r>
+        <w:t xml:space="preserve">6. Deployment results</w:t>
+      </w:r>
+    </w:p>
+    <w:p>
+      <w:pPr>
+        <w:spacing w:after="120"/>
+      </w:pPr>
+      <w:r>
+        <w:t xml:space="preserve">Both solutions were imported into Production as managed by the service account (# CRM-Claude, System Administrator) on 25 October 2026.</w:t>
+      </w:r>
+    </w:p>
+    <w:tbl>
+      <w:tblPr>
+        <w:tblW w:type="dxa" w:w="9026"/>
+        <w:tblBorders>
+          <w:top w:val="single" w:color="auto" w:sz="4"/>
+          <w:left w:val="single" w:color="auto" w:sz="4"/>
+          <w:bottom w:val="single" w:color="auto" w:sz="4"/>
+          <w:right w:val="single" w:color="auto" w:sz="4"/>
+          <w:insideH w:val="single" w:color="auto" w:sz="4"/>
+          <w:insideV w:val="single" w:color="auto" w:sz="4"/>
+        </w:tblBorders>
+      </w:tblPr>
+      <w:tblGrid>
+        <w:gridCol w:w="3600"/>
+        <w:gridCol w:w="1100"/>
+        <w:gridCol w:w="1300"/>
+        <w:gridCol w:w="3026"/>
+      </w:tblGrid>
+      <w:tr>
+        <w:trPr>
+          <w:tblHeader/>
+        </w:trPr>
+        <w:tc>
+          <w:tcPr>
+            <w:tcW w:type="dxa" w:w="3600"/>
+            <w:tcBorders>
+              <w:top w:val="single" w:color="BFBFBF" w:sz="4"/>
+              <w:left w:val="single" w:color="BFBFBF" w:sz="4"/>
+              <w:bottom w:val="single" w:color="BFBFBF" w:sz="4"/>
+              <w:right w:val="single" w:color="BFBFBF" w:sz="4"/>
+            </w:tcBorders>
+            <w:shd w:fill="1F3864" w:color="auto" w:val="clear"/>
+            <w:tcMar>
+              <w:top w:type="dxa" w:w="60"/>
+              <w:left w:type="dxa" w:w="100"/>
+              <w:bottom w:type="dxa" w:w="60"/>
+              <w:right w:type="dxa" w:w="100"/>
+            </w:tcMar>
+          </w:tcPr>
+          <w:p>
+            <w:r>
+              <w:rPr>
+                <w:b/>
+                <w:bCs/>
+                <w:color w:val="FFFFFF"/>
+                <w:sz w:val="18"/>
+                <w:szCs w:val="18"/>
+              </w:rPr>
+              <w:t xml:space="preserve">Solution</w:t>
+            </w:r>
+          </w:p>
+        </w:tc>
+        <w:tc>
+          <w:tcPr>
+            <w:tcW w:type="dxa" w:w="1100"/>
+            <w:tcBorders>
+              <w:top w:val="single" w:color="BFBFBF" w:sz="4"/>
+              <w:left w:val="single" w:color="BFBFBF" w:sz="4"/>
+              <w:bottom w:val="single" w:color="BFBFBF" w:sz="4"/>
+              <w:right w:val="single" w:color="BFBFBF" w:sz="4"/>
+            </w:tcBorders>
+            <w:shd w:fill="1F3864" w:color="auto" w:val="clear"/>
+            <w:tcMar>
+              <w:top w:type="dxa" w:w="60"/>
+              <w:left w:type="dxa" w:w="100"/>
+              <w:bottom w:type="dxa" w:w="60"/>
+              <w:right w:type="dxa" w:w="100"/>
+            </w:tcMar>
+          </w:tcPr>
+          <w:p>
+            <w:r>
+              <w:rPr>
+                <w:b/>
+                <w:bCs/>
+                <w:color w:val="FFFFFF"/>
+                <w:sz w:val="18"/>
+                <w:szCs w:val="18"/>
+              </w:rPr>
+              <w:t xml:space="preserve">Version</w:t>
+            </w:r>
+          </w:p>
+        </w:tc>
+        <w:tc>
+          <w:tcPr>
+            <w:tcW w:type="dxa" w:w="1300"/>
+            <w:tcBorders>
+              <w:top w:val="single" w:color="BFBFBF" w:sz="4"/>
+              <w:left w:val="single" w:color="BFBFBF" w:sz="4"/>
+              <w:bottom w:val="single" w:color="BFBFBF" w:sz="4"/>
+              <w:right w:val="single" w:color="BFBFBF" w:sz="4"/>
+            </w:tcBorders>
+            <w:shd w:fill="1F3864" w:color="auto" w:val="clear"/>
+            <w:tcMar>
+              <w:top w:type="dxa" w:w="60"/>
+              <w:left w:type="dxa" w:w="100"/>
+              <w:bottom w:type="dxa" w:w="60"/>
+              <w:right w:type="dxa" w:w="100"/>
+            </w:tcMar>
+          </w:tcPr>
+          <w:p>
+            <w:r>
+              <w:rPr>
+                <w:b/>
+                <w:bCs/>
+                <w:color w:val="FFFFFF"/>
+                <w:sz w:val="18"/>
+                <w:szCs w:val="18"/>
+              </w:rPr>
+              <w:t xml:space="preserve">Type</w:t>
+            </w:r>
+          </w:p>
+        </w:tc>
+        <w:tc>
+          <w:tcPr>
+            <w:tcW w:type="dxa" w:w="3026"/>
+            <w:tcBorders>
+              <w:top w:val="single" w:color="BFBFBF" w:sz="4"/>
+              <w:left w:val="single" w:color="BFBFBF" w:sz="4"/>
+              <w:bottom w:val="single" w:color="BFBFBF" w:sz="4"/>
+              <w:right w:val="single" w:color="BFBFBF" w:sz="4"/>
+            </w:tcBorders>
+            <w:shd w:fill="1F3864" w:color="auto" w:val="clear"/>
+            <w:tcMar>
+              <w:top w:type="dxa" w:w="60"/>
+              <w:left w:type="dxa" w:w="100"/>
+              <w:bottom w:type="dxa" w:w="60"/>
+              <w:right w:type="dxa" w:w="100"/>
+            </w:tcMar>
+          </w:tcPr>
+          <w:p>
+            <w:r>
+              <w:rPr>
+                <w:b/>
+                <w:bCs/>
+                <w:color w:val="FFFFFF"/>
+                <w:sz w:val="18"/>
+                <w:szCs w:val="18"/>
+              </w:rPr>
+              <w:t xml:space="preserve">Result</w:t>
+            </w:r>
+          </w:p>
+        </w:tc>
+      </w:tr>
+      <w:tr>
+        <w:tc>
+          <w:tcPr>
+            <w:tcW w:type="dxa" w:w="3600"/>
+            <w:tcBorders>
+              <w:top w:val="single" w:color="BFBFBF" w:sz="4"/>
+              <w:left w:val="single" w:color="BFBFBF" w:sz="4"/>
+              <w:bottom w:val="single" w:color="BFBFBF" w:sz="4"/>
+              <w:right w:val="single" w:color="BFBFBF" w:sz="4"/>
+            </w:tcBorders>
+            <w:tcMar>
+              <w:top w:type="dxa" w:w="60"/>
+              <w:left w:type="dxa" w:w="100"/>
+              <w:bottom w:type="dxa" w:w="60"/>
+              <w:right w:type="dxa" w:w="100"/>
+            </w:tcMar>
+          </w:tcPr>
+          <w:p>
+            <w:r>
+              <w:rPr>
+                <w:b w:val="false"/>
+                <w:bCs w:val="false"/>
+                <w:sz w:val="18"/>
+                <w:szCs w:val="18"/>
+              </w:rPr>
+              <w:t xml:space="preserve">AlSanidi | Marketing | Connectors</w:t>
+            </w:r>
+          </w:p>
+        </w:tc>
+        <w:tc>
+          <w:tcPr>
+            <w:tcW w:type="dxa" w:w="1100"/>
+            <w:tcBorders>
+              <w:top w:val="single" w:color="BFBFBF" w:sz="4"/>
+              <w:left w:val="single" w:color="BFBFBF" w:sz="4"/>
+              <w:bottom w:val="single" w:color="BFBFBF" w:sz="4"/>
+              <w:right w:val="single" w:color="BFBFBF" w:sz="4"/>
+            </w:tcBorders>
+            <w:tcMar>
+              <w:top w:type="dxa" w:w="60"/>
+              <w:left w:type="dxa" w:w="100"/>
+              <w:bottom w:type="dxa" w:w="60"/>
+              <w:right w:type="dxa" w:w="100"/>
+            </w:tcMar>
+          </w:tcPr>
+          <w:p>
+            <w:r>
+              <w:rPr>
+                <w:b w:val="false"/>
+                <w:bCs w:val="false"/>
+                <w:sz w:val="18"/>
+                <w:szCs w:val="18"/>
+              </w:rPr>
+              <w:t xml:space="preserve">1.0.0</w:t>
+            </w:r>
+          </w:p>
+        </w:tc>
+        <w:tc>
+          <w:tcPr>
+            <w:tcW w:type="dxa" w:w="1300"/>
+            <w:tcBorders>
+              <w:top w:val="single" w:color="BFBFBF" w:sz="4"/>
+              <w:left w:val="single" w:color="BFBFBF" w:sz="4"/>
+              <w:bottom w:val="single" w:color="BFBFBF" w:sz="4"/>
+              <w:right w:val="single" w:color="BFBFBF" w:sz="4"/>
+            </w:tcBorders>
+            <w:tcMar>
+              <w:top w:type="dxa" w:w="60"/>
+              <w:left w:type="dxa" w:w="100"/>
+              <w:bottom w:type="dxa" w:w="60"/>
+              <w:right w:type="dxa" w:w="100"/>
+            </w:tcMar>
+          </w:tcPr>
+          <w:p>
+            <w:r>
+              <w:rPr>
+                <w:b w:val="false"/>
+                <w:bCs w:val="false"/>
+                <w:sz w:val="18"/>
+                <w:szCs w:val="18"/>
+              </w:rPr>
+              <w:t xml:space="preserve">Managed</w:t>
+            </w:r>
+          </w:p>
+        </w:tc>
+        <w:tc>
+          <w:tcPr>
+            <w:tcW w:type="dxa" w:w="3026"/>
+            <w:tcBorders>
+              <w:top w:val="single" w:color="BFBFBF" w:sz="4"/>
+              <w:left w:val="single" w:color="BFBFBF" w:sz="4"/>
+              <w:bottom w:val="single" w:color="BFBFBF" w:sz="4"/>
+              <w:right w:val="single" w:color="BFBFBF" w:sz="4"/>
+            </w:tcBorders>
+            <w:tcMar>
+              <w:top w:type="dxa" w:w="60"/>
+              <w:left w:type="dxa" w:w="100"/>
+              <w:bottom w:type="dxa" w:w="60"/>
+              <w:right w:type="dxa" w:w="100"/>
+            </w:tcMar>
+          </w:tcPr>
+          <w:p>
+            <w:r>
+              <w:rPr>
+                <w:b w:val="false"/>
+                <w:bCs w:val="false"/>
+                <w:sz w:val="18"/>
+                <w:szCs w:val="18"/>
+              </w:rPr>
+              <w:t xml:space="preserve">Succeeded (18:31-18:34 UTC), 4 connectors registered</w:t>
+            </w:r>
+          </w:p>
+        </w:tc>
+      </w:tr>
+      <w:tr>
+        <w:tc>
+          <w:tcPr>
+            <w:tcW w:type="dxa" w:w="3600"/>
+            <w:tcBorders>
+              <w:top w:val="single" w:color="BFBFBF" w:sz="4"/>
+              <w:left w:val="single" w:color="BFBFBF" w:sz="4"/>
+              <w:bottom w:val="single" w:color="BFBFBF" w:sz="4"/>
+              <w:right w:val="single" w:color="BFBFBF" w:sz="4"/>
+            </w:tcBorders>
+            <w:tcMar>
+              <w:top w:type="dxa" w:w="60"/>
+              <w:left w:type="dxa" w:w="100"/>
+              <w:bottom w:type="dxa" w:w="60"/>
+              <w:right w:type="dxa" w:w="100"/>
+            </w:tcMar>
+          </w:tcPr>
+          <w:p>
+            <w:r>
+              <w:rPr>
+                <w:b w:val="false"/>
+                <w:bCs w:val="false"/>
+                <w:sz w:val="18"/>
+                <w:szCs w:val="18"/>
+              </w:rPr>
+              <w:t xml:space="preserve">AlSanidi | Marketing</w:t>
+            </w:r>
+          </w:p>
+        </w:tc>
+        <w:tc>
+          <w:tcPr>
+            <w:tcW w:type="dxa" w:w="1100"/>
+            <w:tcBorders>
+              <w:top w:val="single" w:color="BFBFBF" w:sz="4"/>
+              <w:left w:val="single" w:color="BFBFBF" w:sz="4"/>
+              <w:bottom w:val="single" w:color="BFBFBF" w:sz="4"/>
+              <w:right w:val="single" w:color="BFBFBF" w:sz="4"/>
+            </w:tcBorders>
+            <w:tcMar>
+              <w:top w:type="dxa" w:w="60"/>
+              <w:left w:type="dxa" w:w="100"/>
+              <w:bottom w:type="dxa" w:w="60"/>
+              <w:right w:type="dxa" w:w="100"/>
+            </w:tcMar>
+          </w:tcPr>
+          <w:p>
+            <w:r>
+              <w:rPr>
+                <w:b w:val="false"/>
+                <w:bCs w:val="false"/>
+                <w:sz w:val="18"/>
+                <w:szCs w:val="18"/>
+              </w:rPr>
+              <w:t xml:space="preserve">1.0.0</w:t>
+            </w:r>
+          </w:p>
+        </w:tc>
+        <w:tc>
+          <w:tcPr>
+            <w:tcW w:type="dxa" w:w="1300"/>
+            <w:tcBorders>
+              <w:top w:val="single" w:color="BFBFBF" w:sz="4"/>
+              <w:left w:val="single" w:color="BFBFBF" w:sz="4"/>
+              <w:bottom w:val="single" w:color="BFBFBF" w:sz="4"/>
+              <w:right w:val="single" w:color="BFBFBF" w:sz="4"/>
+            </w:tcBorders>
+            <w:tcMar>
+              <w:top w:type="dxa" w:w="60"/>
+              <w:left w:type="dxa" w:w="100"/>
+              <w:bottom w:type="dxa" w:w="60"/>
+              <w:right w:type="dxa" w:w="100"/>
+            </w:tcMar>
+          </w:tcPr>
+          <w:p>
+            <w:r>
+              <w:rPr>
+                <w:b w:val="false"/>
+                <w:bCs w:val="false"/>
+                <w:sz w:val="18"/>
+                <w:szCs w:val="18"/>
+              </w:rPr>
+              <w:t xml:space="preserve">Managed</w:t>
+            </w:r>
+          </w:p>
+        </w:tc>
+        <w:tc>
+          <w:tcPr>
+            <w:tcW w:type="dxa" w:w="3026"/>
+            <w:tcBorders>
+              <w:top w:val="single" w:color="BFBFBF" w:sz="4"/>
+              <w:left w:val="single" w:color="BFBFBF" w:sz="4"/>
+              <w:bottom w:val="single" w:color="BFBFBF" w:sz="4"/>
+              <w:right w:val="single" w:color="BFBFBF" w:sz="4"/>
+            </w:tcBorders>
+            <w:tcMar>
+              <w:top w:type="dxa" w:w="60"/>
+              <w:left w:type="dxa" w:w="100"/>
+              <w:bottom w:type="dxa" w:w="60"/>
+              <w:right w:type="dxa" w:w="100"/>
+            </w:tcMar>
+          </w:tcPr>
+          <w:p>
+            <w:r>
+              <w:rPr>
+                <w:b w:val="false"/>
+                <w:bCs w:val="false"/>
+                <w:sz w:val="18"/>
+                <w:szCs w:val="18"/>
+              </w:rPr>
+              <w:t xml:space="preserve">Succeeded (19:15-19:42 UTC), 141 components, warnings only</w:t>
+            </w:r>
+          </w:p>
+        </w:tc>
+      </w:tr>
+    </w:tbl>
+    <w:p>
+      <w:pPr>
+        <w:pStyle w:val="Heading2"/>
+      </w:pPr>
+      <w:r>
+        <w:t xml:space="preserve">6.1 Timeline</w:t>
+      </w:r>
+    </w:p>
+    <w:tbl>
+      <w:tblPr>
+        <w:tblW w:type="dxa" w:w="9026"/>
+        <w:tblBorders>
+          <w:top w:val="single" w:color="auto" w:sz="4"/>
+          <w:left w:val="single" w:color="auto" w:sz="4"/>
+          <w:bottom w:val="single" w:color="auto" w:sz="4"/>
+          <w:right w:val="single" w:color="auto" w:sz="4"/>
+          <w:insideH w:val="single" w:color="auto" w:sz="4"/>
+          <w:insideV w:val="single" w:color="auto" w:sz="4"/>
+        </w:tblBorders>
+      </w:tblPr>
+      <w:tblGrid>
+        <w:gridCol w:w="1500"/>
+        <w:gridCol w:w="7526"/>
+      </w:tblGrid>
+      <w:tr>
+        <w:trPr>
+          <w:tblHeader/>
+        </w:trPr>
+        <w:tc>
+          <w:tcPr>
+            <w:tcW w:type="dxa" w:w="1500"/>
+            <w:tcBorders>
+              <w:top w:val="single" w:color="BFBFBF" w:sz="4"/>
+              <w:left w:val="single" w:color="BFBFBF" w:sz="4"/>
+              <w:bottom w:val="single" w:color="BFBFBF" w:sz="4"/>
+              <w:right w:val="single" w:color="BFBFBF" w:sz="4"/>
+            </w:tcBorders>
+            <w:shd w:fill="1F3864" w:color="auto" w:val="clear"/>
+            <w:tcMar>
+              <w:top w:type="dxa" w:w="60"/>
+              <w:left w:type="dxa" w:w="100"/>
+              <w:bottom w:type="dxa" w:w="60"/>
+              <w:right w:type="dxa" w:w="100"/>
+            </w:tcMar>
+          </w:tcPr>
+          <w:p>
+            <w:r>
+              <w:rPr>
+                <w:b/>
+                <w:bCs/>
+                <w:color w:val="FFFFFF"/>
+                <w:sz w:val="18"/>
+                <w:szCs w:val="18"/>
+              </w:rPr>
+              <w:t xml:space="preserve">Time (UTC)</w:t>
+            </w:r>
+          </w:p>
+        </w:tc>
+        <w:tc>
+          <w:tcPr>
+            <w:tcW w:type="dxa" w:w="7526"/>
+            <w:tcBorders>
+              <w:top w:val="single" w:color="BFBFBF" w:sz="4"/>
+              <w:left w:val="single" w:color="BFBFBF" w:sz="4"/>
+              <w:bottom w:val="single" w:color="BFBFBF" w:sz="4"/>
+              <w:right w:val="single" w:color="BFBFBF" w:sz="4"/>
+            </w:tcBorders>
+            <w:shd w:fill="1F3864" w:color="auto" w:val="clear"/>
+            <w:tcMar>
+              <w:top w:type="dxa" w:w="60"/>
+              <w:left w:type="dxa" w:w="100"/>
+              <w:bottom w:type="dxa" w:w="60"/>
+              <w:right w:type="dxa" w:w="100"/>
+            </w:tcMar>
+          </w:tcPr>
+          <w:p>
+            <w:r>
+              <w:rPr>
+                <w:b/>
+                <w:bCs/>
+                <w:color w:val="FFFFFF"/>
+                <w:sz w:val="18"/>
+                <w:szCs w:val="18"/>
+              </w:rPr>
+              <w:t xml:space="preserve">Event</w:t>
+            </w:r>
+          </w:p>
+        </w:tc>
+      </w:tr>
+      <w:tr>
+        <w:tc>
+          <w:tcPr>
+            <w:tcW w:type="dxa" w:w="1500"/>
+            <w:tcBorders>
+              <w:top w:val="single" w:color="BFBFBF" w:sz="4"/>
+              <w:left w:val="single" w:color="BFBFBF" w:sz="4"/>
+              <w:bottom w:val="single" w:color="BFBFBF" w:sz="4"/>
+              <w:right w:val="single" w:color="BFBFBF" w:sz="4"/>
+            </w:tcBorders>
+            <w:tcMar>
+              <w:top w:type="dxa" w:w="60"/>
+              <w:left w:type="dxa" w:w="100"/>
+              <w:bottom w:type="dxa" w:w="60"/>
+              <w:right w:type="dxa" w:w="100"/>
+            </w:tcMar>
+          </w:tcPr>
+          <w:p>
+            <w:r>
+              <w:rPr>
+                <w:b w:val="false"/>
+                <w:bCs w:val="false"/>
+                <w:sz w:val="18"/>
+                <w:szCs w:val="18"/>
+              </w:rPr>
+              <w:t xml:space="preserve">18:31-18:34</w:t>
+            </w:r>
+          </w:p>
+        </w:tc>
+        <w:tc>
+          <w:tcPr>
+            <w:tcW w:type="dxa" w:w="7526"/>
+            <w:tcBorders>
+              <w:top w:val="single" w:color="BFBFBF" w:sz="4"/>
+              <w:left w:val="single" w:color="BFBFBF" w:sz="4"/>
+              <w:bottom w:val="single" w:color="BFBFBF" w:sz="4"/>
+              <w:right w:val="single" w:color="BFBFBF" w:sz="4"/>
+            </w:tcBorders>
+            <w:tcMar>
+              <w:top w:type="dxa" w:w="60"/>
+              <w:left w:type="dxa" w:w="100"/>
+              <w:bottom w:type="dxa" w:w="60"/>
+              <w:right w:type="dxa" w:w="100"/>
+            </w:tcMar>
+          </w:tcPr>
+          <w:p>
+            <w:r>
+              <w:rPr>
+                <w:b w:val="false"/>
+                <w:bCs w:val="false"/>
+                <w:sz w:val="18"/>
+                <w:szCs w:val="18"/>
+              </w:rPr>
+              <w:t xml:space="preserve">AlSanidi | Marketing | Connectors imported. Meta, Snap, TikTok and Google Ads registered in Production.</w:t>
+            </w:r>
+          </w:p>
+        </w:tc>
+      </w:tr>
+      <w:tr>
+        <w:tc>
+          <w:tcPr>
+            <w:tcW w:type="dxa" w:w="1500"/>
+            <w:tcBorders>
+              <w:top w:val="single" w:color="BFBFBF" w:sz="4"/>
+              <w:left w:val="single" w:color="BFBFBF" w:sz="4"/>
+              <w:bottom w:val="single" w:color="BFBFBF" w:sz="4"/>
+              <w:right w:val="single" w:color="BFBFBF" w:sz="4"/>
+            </w:tcBorders>
+            <w:tcMar>
+              <w:top w:type="dxa" w:w="60"/>
+              <w:left w:type="dxa" w:w="100"/>
+              <w:bottom w:type="dxa" w:w="60"/>
+              <w:right w:type="dxa" w:w="100"/>
+            </w:tcMar>
+          </w:tcPr>
+          <w:p>
+            <w:r>
+              <w:rPr>
+                <w:b w:val="false"/>
+                <w:bCs w:val="false"/>
+                <w:sz w:val="18"/>
+                <w:szCs w:val="18"/>
+              </w:rPr>
+              <w:t xml:space="preserve">18:35-18:48</w:t>
+            </w:r>
+          </w:p>
+        </w:tc>
+        <w:tc>
+          <w:tcPr>
+            <w:tcW w:type="dxa" w:w="7526"/>
+            <w:tcBorders>
+              <w:top w:val="single" w:color="BFBFBF" w:sz="4"/>
+              <w:left w:val="single" w:color="BFBFBF" w:sz="4"/>
+              <w:bottom w:val="single" w:color="BFBFBF" w:sz="4"/>
+              <w:right w:val="single" w:color="BFBFBF" w:sz="4"/>
+            </w:tcBorders>
+            <w:tcMar>
+              <w:top w:type="dxa" w:w="60"/>
+              <w:left w:type="dxa" w:w="100"/>
+              <w:bottom w:type="dxa" w:w="60"/>
+              <w:right w:type="dxa" w:w="100"/>
+            </w:tcMar>
+          </w:tcPr>
+          <w:p>
+            <w:r>
+              <w:rPr>
+                <w:b w:val="false"/>
+                <w:bCs w:val="false"/>
+                <w:sz w:val="18"/>
+                <w:szCs w:val="18"/>
+              </w:rPr>
+              <w:t xml:space="preserve">First AlSanidi | Marketing import failed at about 80% and was rolled back: a Microsoft automatic update (MicrosoftDynamicsScheduling3_CumulativePatch 3.12.4002.87 to 3.12.4003.30) started during the import and the two blocked each other. No components were left behind.</w:t>
+            </w:r>
+          </w:p>
+        </w:tc>
+      </w:tr>
+      <w:tr>
+        <w:tc>
+          <w:tcPr>
+            <w:tcW w:type="dxa" w:w="1500"/>
+            <w:tcBorders>
+              <w:top w:val="single" w:color="BFBFBF" w:sz="4"/>
+              <w:left w:val="single" w:color="BFBFBF" w:sz="4"/>
+              <w:bottom w:val="single" w:color="BFBFBF" w:sz="4"/>
+              <w:right w:val="single" w:color="BFBFBF" w:sz="4"/>
+            </w:tcBorders>
+            <w:tcMar>
+              <w:top w:type="dxa" w:w="60"/>
+              <w:left w:type="dxa" w:w="100"/>
+              <w:bottom w:type="dxa" w:w="60"/>
+              <w:right w:type="dxa" w:w="100"/>
+            </w:tcMar>
+          </w:tcPr>
+          <w:p>
+            <w:r>
+              <w:rPr>
+                <w:b w:val="false"/>
+                <w:bCs w:val="false"/>
+                <w:sz w:val="18"/>
+                <w:szCs w:val="18"/>
+              </w:rPr>
+              <w:t xml:space="preserve">18:49-19:13</w:t>
+            </w:r>
+          </w:p>
+        </w:tc>
+        <w:tc>
+          <w:tcPr>
+            <w:tcW w:type="dxa" w:w="7526"/>
+            <w:tcBorders>
+              <w:top w:val="single" w:color="BFBFBF" w:sz="4"/>
+              <w:left w:val="single" w:color="BFBFBF" w:sz="4"/>
+              <w:bottom w:val="single" w:color="BFBFBF" w:sz="4"/>
+              <w:right w:val="single" w:color="BFBFBF" w:sz="4"/>
+            </w:tcBorders>
+            <w:tcMar>
+              <w:top w:type="dxa" w:w="60"/>
+              <w:left w:type="dxa" w:w="100"/>
+              <w:bottom w:type="dxa" w:w="60"/>
+              <w:right w:type="dxa" w:w="100"/>
+            </w:tcMar>
+          </w:tcPr>
+          <w:p>
+            <w:r>
+              <w:rPr>
+                <w:b w:val="false"/>
+                <w:bCs w:val="false"/>
+                <w:sz w:val="18"/>
+                <w:szCs w:val="18"/>
+              </w:rPr>
+              <w:t xml:space="preserve">Microsoft finished the update chain: the scheduling patch, SchedulingOperationsAgent, Scheduling Anchor, ResourceSchedulingControls, CSS Helper, CoreServiceScheduling and its anchor.</w:t>
+            </w:r>
+          </w:p>
+        </w:tc>
+      </w:tr>
+      <w:tr>
+        <w:tc>
+          <w:tcPr>
+            <w:tcW w:type="dxa" w:w="1500"/>
+            <w:tcBorders>
+              <w:top w:val="single" w:color="BFBFBF" w:sz="4"/>
+              <w:left w:val="single" w:color="BFBFBF" w:sz="4"/>
+              <w:bottom w:val="single" w:color="BFBFBF" w:sz="4"/>
+              <w:right w:val="single" w:color="BFBFBF" w:sz="4"/>
+            </w:tcBorders>
+            <w:tcMar>
+              <w:top w:type="dxa" w:w="60"/>
+              <w:left w:type="dxa" w:w="100"/>
+              <w:bottom w:type="dxa" w:w="60"/>
+              <w:right w:type="dxa" w:w="100"/>
+            </w:tcMar>
+          </w:tcPr>
+          <w:p>
+            <w:r>
+              <w:rPr>
+                <w:b w:val="false"/>
+                <w:bCs w:val="false"/>
+                <w:sz w:val="18"/>
+                <w:szCs w:val="18"/>
+              </w:rPr>
+              <w:t xml:space="preserve">19:15-19:42</w:t>
+            </w:r>
+          </w:p>
+        </w:tc>
+        <w:tc>
+          <w:tcPr>
+            <w:tcW w:type="dxa" w:w="7526"/>
+            <w:tcBorders>
+              <w:top w:val="single" w:color="BFBFBF" w:sz="4"/>
+              <w:left w:val="single" w:color="BFBFBF" w:sz="4"/>
+              <w:bottom w:val="single" w:color="BFBFBF" w:sz="4"/>
+              <w:right w:val="single" w:color="BFBFBF" w:sz="4"/>
+            </w:tcBorders>
+            <w:tcMar>
+              <w:top w:type="dxa" w:w="60"/>
+              <w:left w:type="dxa" w:w="100"/>
+              <w:bottom w:type="dxa" w:w="60"/>
+              <w:right w:type="dxa" w:w="100"/>
+            </w:tcMar>
+          </w:tcPr>
+          <w:p>
+            <w:r>
+              <w:rPr>
+                <w:b w:val="false"/>
+                <w:bCs w:val="false"/>
+                <w:sz w:val="18"/>
+                <w:szCs w:val="18"/>
+              </w:rPr>
+              <w:t xml:space="preserve">AlSanidi | Marketing import retried after two quiet minutes. Succeeded.</w:t>
+            </w:r>
+          </w:p>
+        </w:tc>
+      </w:tr>
+    </w:tbl>
+    <w:p>
+      <w:pPr>
+        <w:pStyle w:val="Heading2"/>
+      </w:pPr>
+      <w:r>
+        <w:t xml:space="preserve">6.2 Installed components</w:t>
+      </w:r>
+    </w:p>
+    <w:p>
+      <w:pPr>
+        <w:pStyle w:val="ListParagraph"/>
+        <w:numPr>
+          <w:ilvl w:val="0"/>
+          <w:numId w:val="2"/>
+        </w:numPr>
+        <w:spacing w:after="60"/>
+      </w:pPr>
+      <w:r>
+        <w:t xml:space="preserve">22 sanidi_ tables, the AlSanidi | Marketing app, the AlSanidi-MarketingManager agent, 15 environment variables, 5 connection references, web resources and global choices.</w:t>
+      </w:r>
+    </w:p>
+    <w:p>
+      <w:pPr>
+        <w:pStyle w:val="Heading2"/>
+      </w:pPr>
+      <w:r>
+        <w:t xml:space="preserve">6.3 Flow and process state after import</w:t>
+      </w:r>
+    </w:p>
+    <w:tbl>
+      <w:tblPr>
+        <w:tblW w:type="dxa" w:w="9026"/>
+        <w:tblBorders>
+          <w:top w:val="single" w:color="auto" w:sz="4"/>
+          <w:left w:val="single" w:color="auto" w:sz="4"/>
+          <w:bottom w:val="single" w:color="auto" w:sz="4"/>
+          <w:right w:val="single" w:color="auto" w:sz="4"/>
+          <w:insideH w:val="single" w:color="auto" w:sz="4"/>
+          <w:insideV w:val="single" w:color="auto" w:sz="4"/>
+        </w:tblBorders>
+      </w:tblPr>
+      <w:tblGrid>
+        <w:gridCol w:w="1500"/>
+        <w:gridCol w:w="7526"/>
+      </w:tblGrid>
+      <w:tr>
+        <w:trPr>
+          <w:tblHeader/>
+        </w:trPr>
+        <w:tc>
+          <w:tcPr>
+            <w:tcW w:type="dxa" w:w="1500"/>
+            <w:tcBorders>
+              <w:top w:val="single" w:color="BFBFBF" w:sz="4"/>
+              <w:left w:val="single" w:color="BFBFBF" w:sz="4"/>
+              <w:bottom w:val="single" w:color="BFBFBF" w:sz="4"/>
+              <w:right w:val="single" w:color="BFBFBF" w:sz="4"/>
+            </w:tcBorders>
+            <w:shd w:fill="1F3864" w:color="auto" w:val="clear"/>
+            <w:tcMar>
+              <w:top w:type="dxa" w:w="60"/>
+              <w:left w:type="dxa" w:w="100"/>
+              <w:bottom w:type="dxa" w:w="60"/>
+              <w:right w:type="dxa" w:w="100"/>
+            </w:tcMar>
+          </w:tcPr>
+          <w:p>
+            <w:r>
+              <w:rPr>
+                <w:b/>
+                <w:bCs/>
+                <w:color w:val="FFFFFF"/>
+                <w:sz w:val="18"/>
+                <w:szCs w:val="18"/>
+              </w:rPr>
+              <w:t xml:space="preserve">State</w:t>
+            </w:r>
+          </w:p>
+        </w:tc>
+        <w:tc>
+          <w:tcPr>
+            <w:tcW w:type="dxa" w:w="7526"/>
+            <w:tcBorders>
+              <w:top w:val="single" w:color="BFBFBF" w:sz="4"/>
+              <w:left w:val="single" w:color="BFBFBF" w:sz="4"/>
+              <w:bottom w:val="single" w:color="BFBFBF" w:sz="4"/>
+              <w:right w:val="single" w:color="BFBFBF" w:sz="4"/>
+            </w:tcBorders>
+            <w:shd w:fill="1F3864" w:color="auto" w:val="clear"/>
+            <w:tcMar>
+              <w:top w:type="dxa" w:w="60"/>
+              <w:left w:type="dxa" w:w="100"/>
+              <w:bottom w:type="dxa" w:w="60"/>
+              <w:right w:type="dxa" w:w="100"/>
+            </w:tcMar>
+          </w:tcPr>
+          <w:p>
+            <w:r>
+              <w:rPr>
+                <w:b/>
+                <w:bCs/>
+                <w:color w:val="FFFFFF"/>
+                <w:sz w:val="18"/>
+                <w:szCs w:val="18"/>
+              </w:rPr>
+              <w:t xml:space="preserve">Flows and processes</w:t>
+            </w:r>
+          </w:p>
+        </w:tc>
+      </w:tr>
+      <w:tr>
+        <w:tc>
+          <w:tcPr>
+            <w:tcW w:type="dxa" w:w="1500"/>
+            <w:tcBorders>
+              <w:top w:val="single" w:color="BFBFBF" w:sz="4"/>
+              <w:left w:val="single" w:color="BFBFBF" w:sz="4"/>
+              <w:bottom w:val="single" w:color="BFBFBF" w:sz="4"/>
+              <w:right w:val="single" w:color="BFBFBF" w:sz="4"/>
+            </w:tcBorders>
+            <w:tcMar>
+              <w:top w:type="dxa" w:w="60"/>
+              <w:left w:type="dxa" w:w="100"/>
+              <w:bottom w:type="dxa" w:w="60"/>
+              <w:right w:type="dxa" w:w="100"/>
+            </w:tcMar>
+          </w:tcPr>
+          <w:p>
+            <w:r>
+              <w:rPr>
+                <w:b w:val="false"/>
+                <w:bCs w:val="false"/>
+                <w:sz w:val="18"/>
+                <w:szCs w:val="18"/>
+              </w:rPr>
+              <w:t xml:space="preserve">On (10)</w:t>
+            </w:r>
+          </w:p>
+        </w:tc>
+        <w:tc>
+          <w:tcPr>
+            <w:tcW w:type="dxa" w:w="7526"/>
+            <w:tcBorders>
+              <w:top w:val="single" w:color="BFBFBF" w:sz="4"/>
+              <w:left w:val="single" w:color="BFBFBF" w:sz="4"/>
+              <w:bottom w:val="single" w:color="BFBFBF" w:sz="4"/>
+              <w:right w:val="single" w:color="BFBFBF" w:sz="4"/>
+            </w:tcBorders>
+            <w:tcMar>
+              <w:top w:type="dxa" w:w="60"/>
+              <w:left w:type="dxa" w:w="100"/>
+              <w:bottom w:type="dxa" w:w="60"/>
+              <w:right w:type="dxa" w:w="100"/>
+            </w:tcMar>
+          </w:tcPr>
+          <w:p>
+            <w:r>
+              <w:rPr>
+                <w:b w:val="false"/>
+                <w:bCs w:val="false"/>
+                <w:sz w:val="18"/>
+                <w:szCs w:val="18"/>
+              </w:rPr>
+              <w:t xml:space="preserve">Map Google Ads Advertisement Cost to Advertisement; Map Google Ads Campaign Cost to Campaign; Map Meta Advertisement Spend to Advertisement; Map Meta Campaign Spend to Campaign; Map Snap Advertisement Spend to Advertisement; Map Snap Campaign Spend to Campaign; Map Social Media Cost to Advertisement; Map Social Media Cost to Campaign; business rules Show/Hide Influencer and Show/Hide Product or Category by Item Type.</w:t>
+            </w:r>
+          </w:p>
+        </w:tc>
+      </w:tr>
+      <w:tr>
+        <w:tc>
+          <w:tcPr>
+            <w:tcW w:type="dxa" w:w="1500"/>
+            <w:tcBorders>
+              <w:top w:val="single" w:color="BFBFBF" w:sz="4"/>
+              <w:left w:val="single" w:color="BFBFBF" w:sz="4"/>
+              <w:bottom w:val="single" w:color="BFBFBF" w:sz="4"/>
+              <w:right w:val="single" w:color="BFBFBF" w:sz="4"/>
+            </w:tcBorders>
+            <w:tcMar>
+              <w:top w:type="dxa" w:w="60"/>
+              <w:left w:type="dxa" w:w="100"/>
+              <w:bottom w:type="dxa" w:w="60"/>
+              <w:right w:type="dxa" w:w="100"/>
+            </w:tcMar>
+          </w:tcPr>
+          <w:p>
+            <w:r>
+              <w:rPr>
+                <w:b w:val="false"/>
+                <w:bCs w:val="false"/>
+                <w:sz w:val="18"/>
+                <w:szCs w:val="18"/>
+              </w:rPr>
+              <w:t xml:space="preserve">Off (20)</w:t>
+            </w:r>
+          </w:p>
+        </w:tc>
+        <w:tc>
+          <w:tcPr>
+            <w:tcW w:type="dxa" w:w="7526"/>
+            <w:tcBorders>
+              <w:top w:val="single" w:color="BFBFBF" w:sz="4"/>
+              <w:left w:val="single" w:color="BFBFBF" w:sz="4"/>
+              <w:bottom w:val="single" w:color="BFBFBF" w:sz="4"/>
+              <w:right w:val="single" w:color="BFBFBF" w:sz="4"/>
+            </w:tcBorders>
+            <w:tcMar>
+              <w:top w:type="dxa" w:w="60"/>
+              <w:left w:type="dxa" w:w="100"/>
+              <w:bottom w:type="dxa" w:w="60"/>
+              <w:right w:type="dxa" w:w="100"/>
+            </w:tcMar>
+          </w:tcPr>
+          <w:p>
+            <w:r>
+              <w:rPr>
+                <w:b w:val="false"/>
+                <w:bCs w:val="false"/>
+                <w:sz w:val="18"/>
+                <w:szCs w:val="18"/>
+              </w:rPr>
+              <w:t xml:space="preserve">All 17 'Get ...' flows (Google Ads 5, Meta 4, Snap 4, TikTok 4); Map TikTok Advertisement Spend to Advertisement and Map TikTok Campaign Spend to Campaign (off in UAT too); Sync Control - Run Sync Request.</w:t>
+            </w:r>
+          </w:p>
+        </w:tc>
+      </w:tr>
+    </w:tbl>
+    <w:p>
+      <w:pPr>
+        <w:pStyle w:val="Heading2"/>
+      </w:pPr>
+      <w:r>
+        <w:t xml:space="preserve">6.4 Import warnings</w:t>
+      </w:r>
+    </w:p>
+    <w:p>
+      <w:pPr>
+        <w:pStyle w:val="ListParagraph"/>
+        <w:numPr>
+          <w:ilvl w:val="0"/>
+          <w:numId w:val="2"/>
+        </w:numPr>
+        <w:spacing w:after="60"/>
+      </w:pPr>
+      <w:r>
+        <w:rPr>
+          <w:b/>
+          <w:bCs/>
+        </w:rPr>
+        <w:t xml:space="preserve">14 'Get ...' flows: </w:t>
+      </w:r>
+      <w:r>
+        <w:t xml:space="preserve">'A connector was imported, however the related connection references need connections created and then any dependent flows can be started.' Expected - no connections exist in Production yet.</w:t>
+      </w:r>
+    </w:p>
+    <w:p>
+      <w:pPr>
+        <w:pStyle w:val="ListParagraph"/>
+        <w:numPr>
+          <w:ilvl w:val="0"/>
+          <w:numId w:val="2"/>
+        </w:numPr>
+        <w:spacing w:after="60"/>
+      </w:pPr>
+      <w:r>
+        <w:rPr>
+          <w:b/>
+          <w:bCs/>
+        </w:rPr>
+        <w:t xml:space="preserve">Sync Control - Run Sync Request: </w:t>
+      </w:r>
+      <w:r>
+        <w:t xml:space="preserve">could not be turned on ('BadRequest / MultipleErrorsOccurred'). Most likely because the child flows it runs are off and have no connections; turn it on after step 4 below.</w:t>
+      </w:r>
+    </w:p>
+    <w:p>
+      <w:pPr>
+        <w:pStyle w:val="ListParagraph"/>
+        <w:numPr>
+          <w:ilvl w:val="0"/>
+          <w:numId w:val="2"/>
+        </w:numPr>
+        <w:spacing w:after="60"/>
+      </w:pPr>
+      <w:r>
+        <w:rPr>
+          <w:b/>
+          <w:bCs/>
+        </w:rPr>
+        <w:t xml:space="preserve">Map flows: </w:t>
+      </w:r>
+      <w:r>
+        <w:t xml:space="preserve">the 8 Map flows turned on although the Dataverse connection reference has no connection yet. They are owned by the # CRM-Claude service account; check them after the Dataverse connection is linked.</w:t>
+      </w:r>
+    </w:p>
+    <w:p>
+      <w:pPr>
+        <w:pStyle w:val="Heading2"/>
+      </w:pPr>
+      <w:r>
+        <w:t xml:space="preserve">6.5 Post-deployment steps (owner: AlSanidi team)</w:t>
+      </w:r>
+    </w:p>
+    <w:tbl>
+      <w:tblPr>
+        <w:tblW w:type="dxa" w:w="9026"/>
+        <w:tblBorders>
+          <w:top w:val="single" w:color="auto" w:sz="4"/>
+          <w:left w:val="single" w:color="auto" w:sz="4"/>
+          <w:bottom w:val="single" w:color="auto" w:sz="4"/>
+          <w:right w:val="single" w:color="auto" w:sz="4"/>
+          <w:insideH w:val="single" w:color="auto" w:sz="4"/>
+          <w:insideV w:val="single" w:color="auto" w:sz="4"/>
+        </w:tblBorders>
+      </w:tblPr>
+      <w:tblGrid>
+        <w:gridCol w:w="500"/>
+        <w:gridCol w:w="8526"/>
+      </w:tblGrid>
+      <w:tr>
+        <w:trPr>
+          <w:tblHeader/>
+        </w:trPr>
+        <w:tc>
+          <w:tcPr>
+            <w:tcW w:type="dxa" w:w="500"/>
+            <w:tcBorders>
+              <w:top w:val="single" w:color="BFBFBF" w:sz="4"/>
+              <w:left w:val="single" w:color="BFBFBF" w:sz="4"/>
+              <w:bottom w:val="single" w:color="BFBFBF" w:sz="4"/>
+              <w:right w:val="single" w:color="BFBFBF" w:sz="4"/>
+            </w:tcBorders>
+            <w:shd w:fill="1F3864" w:color="auto" w:val="clear"/>
+            <w:tcMar>
+              <w:top w:type="dxa" w:w="60"/>
+              <w:left w:type="dxa" w:w="100"/>
+              <w:bottom w:type="dxa" w:w="60"/>
+              <w:right w:type="dxa" w:w="100"/>
+            </w:tcMar>
+          </w:tcPr>
+          <w:p>
+            <w:r>
+              <w:rPr>
+                <w:b/>
+                <w:bCs/>
+                <w:color w:val="FFFFFF"/>
+                <w:sz w:val="18"/>
+                <w:szCs w:val="18"/>
+              </w:rPr>
+              <w:t xml:space="preserve">#</w:t>
+            </w:r>
+          </w:p>
+        </w:tc>
+        <w:tc>
+          <w:tcPr>
+            <w:tcW w:type="dxa" w:w="8526"/>
+            <w:tcBorders>
+              <w:top w:val="single" w:color="BFBFBF" w:sz="4"/>
+              <w:left w:val="single" w:color="BFBFBF" w:sz="4"/>
+              <w:bottom w:val="single" w:color="BFBFBF" w:sz="4"/>
+              <w:right w:val="single" w:color="BFBFBF" w:sz="4"/>
+            </w:tcBorders>
+            <w:shd w:fill="1F3864" w:color="auto" w:val="clear"/>
+            <w:tcMar>
+              <w:top w:type="dxa" w:w="60"/>
+              <w:left w:type="dxa" w:w="100"/>
+              <w:bottom w:type="dxa" w:w="60"/>
+              <w:right w:type="dxa" w:w="100"/>
+            </w:tcMar>
+          </w:tcPr>
+          <w:p>
+            <w:r>
+              <w:rPr>
+                <w:b/>
+                <w:bCs/>
+                <w:color w:val="FFFFFF"/>
+                <w:sz w:val="18"/>
+                <w:szCs w:val="18"/>
+              </w:rPr>
+              <w:t xml:space="preserve">Step</w:t>
+            </w:r>
+          </w:p>
+        </w:tc>
+      </w:tr>
+      <w:tr>
+        <w:tc>
+          <w:tcPr>
+            <w:tcW w:type="dxa" w:w="500"/>
+            <w:tcBorders>
+              <w:top w:val="single" w:color="BFBFBF" w:sz="4"/>
+              <w:left w:val="single" w:color="BFBFBF" w:sz="4"/>
+              <w:bottom w:val="single" w:color="BFBFBF" w:sz="4"/>
+              <w:right w:val="single" w:color="BFBFBF" w:sz="4"/>
+            </w:tcBorders>
+            <w:tcMar>
+              <w:top w:type="dxa" w:w="60"/>
+              <w:left w:type="dxa" w:w="100"/>
+              <w:bottom w:type="dxa" w:w="60"/>
+              <w:right w:type="dxa" w:w="100"/>
+            </w:tcMar>
+          </w:tcPr>
+          <w:p>
+            <w:r>
+              <w:rPr>
+                <w:b w:val="false"/>
+                <w:bCs w:val="false"/>
+                <w:sz w:val="18"/>
+                <w:szCs w:val="18"/>
+              </w:rPr>
+              <w:t xml:space="preserve">1</w:t>
+            </w:r>
+          </w:p>
+        </w:tc>
+        <w:tc>
+          <w:tcPr>
+            <w:tcW w:type="dxa" w:w="8526"/>
+            <w:tcBorders>
+              <w:top w:val="single" w:color="BFBFBF" w:sz="4"/>
+              <w:left w:val="single" w:color="BFBFBF" w:sz="4"/>
+              <w:bottom w:val="single" w:color="BFBFBF" w:sz="4"/>
+              <w:right w:val="single" w:color="BFBFBF" w:sz="4"/>
+            </w:tcBorders>
+            <w:tcMar>
+              <w:top w:type="dxa" w:w="60"/>
+              <w:left w:type="dxa" w:w="100"/>
+              <w:bottom w:type="dxa" w:w="60"/>
+              <w:right w:type="dxa" w:w="100"/>
+            </w:tcMar>
+          </w:tcPr>
+          <w:p>
+            <w:r>
+              <w:rPr>
+                <w:b w:val="false"/>
+                <w:bCs w:val="false"/>
+                <w:sz w:val="18"/>
+                <w:szCs w:val="18"/>
+              </w:rPr>
+              <w:t xml:space="preserve">Snap connector: enter the OAuth client secret on the connector (not exported).</w:t>
+            </w:r>
+          </w:p>
+        </w:tc>
+      </w:tr>
+      <w:tr>
+        <w:tc>
+          <w:tcPr>
+            <w:tcW w:type="dxa" w:w="500"/>
+            <w:tcBorders>
+              <w:top w:val="single" w:color="BFBFBF" w:sz="4"/>
+              <w:left w:val="single" w:color="BFBFBF" w:sz="4"/>
+              <w:bottom w:val="single" w:color="BFBFBF" w:sz="4"/>
+              <w:right w:val="single" w:color="BFBFBF" w:sz="4"/>
+            </w:tcBorders>
+            <w:tcMar>
+              <w:top w:type="dxa" w:w="60"/>
+              <w:left w:type="dxa" w:w="100"/>
+              <w:bottom w:type="dxa" w:w="60"/>
+              <w:right w:type="dxa" w:w="100"/>
+            </w:tcMar>
+          </w:tcPr>
+          <w:p>
+            <w:r>
+              <w:rPr>
+                <w:b w:val="false"/>
+                <w:bCs w:val="false"/>
+                <w:sz w:val="18"/>
+                <w:szCs w:val="18"/>
+              </w:rPr>
+              <w:t xml:space="preserve">2</w:t>
+            </w:r>
+          </w:p>
+        </w:tc>
+        <w:tc>
+          <w:tcPr>
+            <w:tcW w:type="dxa" w:w="8526"/>
+            <w:tcBorders>
+              <w:top w:val="single" w:color="BFBFBF" w:sz="4"/>
+              <w:left w:val="single" w:color="BFBFBF" w:sz="4"/>
+              <w:bottom w:val="single" w:color="BFBFBF" w:sz="4"/>
+              <w:right w:val="single" w:color="BFBFBF" w:sz="4"/>
+            </w:tcBorders>
+            <w:tcMar>
+              <w:top w:type="dxa" w:w="60"/>
+              <w:left w:type="dxa" w:w="100"/>
+              <w:bottom w:type="dxa" w:w="60"/>
+              <w:right w:type="dxa" w:w="100"/>
+            </w:tcMar>
+          </w:tcPr>
+          <w:p>
+            <w:r>
+              <w:rPr>
+                <w:b w:val="false"/>
+                <w:bCs w:val="false"/>
+                <w:sz w:val="18"/>
+                <w:szCs w:val="18"/>
+              </w:rPr>
+              <w:t xml:space="preserve">Connections: create Meta (new, rotated token), Snap, Google Ads, TikTok and Microsoft Dataverse connections and link them to the 5 connection references.</w:t>
+            </w:r>
+          </w:p>
+        </w:tc>
+      </w:tr>
+      <w:tr>
+        <w:tc>
+          <w:tcPr>
+            <w:tcW w:type="dxa" w:w="500"/>
+            <w:tcBorders>
+              <w:top w:val="single" w:color="BFBFBF" w:sz="4"/>
+              <w:left w:val="single" w:color="BFBFBF" w:sz="4"/>
+              <w:bottom w:val="single" w:color="BFBFBF" w:sz="4"/>
+              <w:right w:val="single" w:color="BFBFBF" w:sz="4"/>
+            </w:tcBorders>
+            <w:tcMar>
+              <w:top w:type="dxa" w:w="60"/>
+              <w:left w:type="dxa" w:w="100"/>
+              <w:bottom w:type="dxa" w:w="60"/>
+              <w:right w:type="dxa" w:w="100"/>
+            </w:tcMar>
+          </w:tcPr>
+          <w:p>
+            <w:r>
+              <w:rPr>
+                <w:b w:val="false"/>
+                <w:bCs w:val="false"/>
+                <w:sz w:val="18"/>
+                <w:szCs w:val="18"/>
+              </w:rPr>
+              <w:t xml:space="preserve">3</w:t>
+            </w:r>
+          </w:p>
+        </w:tc>
+        <w:tc>
+          <w:tcPr>
+            <w:tcW w:type="dxa" w:w="8526"/>
+            <w:tcBorders>
+              <w:top w:val="single" w:color="BFBFBF" w:sz="4"/>
+              <w:left w:val="single" w:color="BFBFBF" w:sz="4"/>
+              <w:bottom w:val="single" w:color="BFBFBF" w:sz="4"/>
+              <w:right w:val="single" w:color="BFBFBF" w:sz="4"/>
+            </w:tcBorders>
+            <w:tcMar>
+              <w:top w:type="dxa" w:w="60"/>
+              <w:left w:type="dxa" w:w="100"/>
+              <w:bottom w:type="dxa" w:w="60"/>
+              <w:right w:type="dxa" w:w="100"/>
+            </w:tcMar>
+          </w:tcPr>
+          <w:p>
+            <w:r>
+              <w:rPr>
+                <w:b w:val="false"/>
+                <w:bCs w:val="false"/>
+                <w:sz w:val="18"/>
+                <w:szCs w:val="18"/>
+              </w:rPr>
+              <w:t xml:space="preserve">Environment variables: set Production values, including sanidi_MarketingAgent_EnvironmentId, the Key Vault reference for sanidi_AdminAccountId and the rotated Google Ads credentials.</w:t>
+            </w:r>
+          </w:p>
+        </w:tc>
+      </w:tr>
+      <w:tr>
+        <w:tc>
+          <w:tcPr>
+            <w:tcW w:type="dxa" w:w="500"/>
+            <w:tcBorders>
+              <w:top w:val="single" w:color="BFBFBF" w:sz="4"/>
+              <w:left w:val="single" w:color="BFBFBF" w:sz="4"/>
+              <w:bottom w:val="single" w:color="BFBFBF" w:sz="4"/>
+              <w:right w:val="single" w:color="BFBFBF" w:sz="4"/>
+            </w:tcBorders>
+            <w:tcMar>
+              <w:top w:type="dxa" w:w="60"/>
+              <w:left w:type="dxa" w:w="100"/>
+              <w:bottom w:type="dxa" w:w="60"/>
+              <w:right w:type="dxa" w:w="100"/>
+            </w:tcMar>
+          </w:tcPr>
+          <w:p>
+            <w:r>
+              <w:rPr>
+                <w:b w:val="false"/>
+                <w:bCs w:val="false"/>
+                <w:sz w:val="18"/>
+                <w:szCs w:val="18"/>
+              </w:rPr>
+              <w:t xml:space="preserve">4</w:t>
+            </w:r>
+          </w:p>
+        </w:tc>
+        <w:tc>
+          <w:tcPr>
+            <w:tcW w:type="dxa" w:w="8526"/>
+            <w:tcBorders>
+              <w:top w:val="single" w:color="BFBFBF" w:sz="4"/>
+              <w:left w:val="single" w:color="BFBFBF" w:sz="4"/>
+              <w:bottom w:val="single" w:color="BFBFBF" w:sz="4"/>
+              <w:right w:val="single" w:color="BFBFBF" w:sz="4"/>
+            </w:tcBorders>
+            <w:tcMar>
+              <w:top w:type="dxa" w:w="60"/>
+              <w:left w:type="dxa" w:w="100"/>
+              <w:bottom w:type="dxa" w:w="60"/>
+              <w:right w:type="dxa" w:w="100"/>
+            </w:tcMar>
+          </w:tcPr>
+          <w:p>
+            <w:r>
+              <w:rPr>
+                <w:b w:val="false"/>
+                <w:bCs w:val="false"/>
+                <w:sz w:val="18"/>
+                <w:szCs w:val="18"/>
+              </w:rPr>
+              <w:t xml:space="preserve">Turn on the 'Get ...' flows. Set run-only connections to 'Use this connection' on Get Meta Campaigns, Get Meta Insights, Get Snap Insights and Get Google Ads Insights, then turn on Sync Control - Run Sync Request.</w:t>
+            </w:r>
+          </w:p>
+        </w:tc>
+      </w:tr>
+      <w:tr>
+        <w:tc>
+          <w:tcPr>
+            <w:tcW w:type="dxa" w:w="500"/>
+            <w:tcBorders>
+              <w:top w:val="single" w:color="BFBFBF" w:sz="4"/>
+              <w:left w:val="single" w:color="BFBFBF" w:sz="4"/>
+              <w:bottom w:val="single" w:color="BFBFBF" w:sz="4"/>
+              <w:right w:val="single" w:color="BFBFBF" w:sz="4"/>
+            </w:tcBorders>
+            <w:tcMar>
+              <w:top w:type="dxa" w:w="60"/>
+              <w:left w:type="dxa" w:w="100"/>
+              <w:bottom w:type="dxa" w:w="60"/>
+              <w:right w:type="dxa" w:w="100"/>
+            </w:tcMar>
+          </w:tcPr>
+          <w:p>
+            <w:r>
+              <w:rPr>
+                <w:b w:val="false"/>
+                <w:bCs w:val="false"/>
+                <w:sz w:val="18"/>
+                <w:szCs w:val="18"/>
+              </w:rPr>
+              <w:t xml:space="preserve">5</w:t>
+            </w:r>
+          </w:p>
+        </w:tc>
+        <w:tc>
+          <w:tcPr>
+            <w:tcW w:type="dxa" w:w="8526"/>
+            <w:tcBorders>
+              <w:top w:val="single" w:color="BFBFBF" w:sz="4"/>
+              <w:left w:val="single" w:color="BFBFBF" w:sz="4"/>
+              <w:bottom w:val="single" w:color="BFBFBF" w:sz="4"/>
+              <w:right w:val="single" w:color="BFBFBF" w:sz="4"/>
+            </w:tcBorders>
+            <w:tcMar>
+              <w:top w:type="dxa" w:w="60"/>
+              <w:left w:type="dxa" w:w="100"/>
+              <w:bottom w:type="dxa" w:w="60"/>
+              <w:right w:type="dxa" w:w="100"/>
+            </w:tcMar>
+          </w:tcPr>
+          <w:p>
+            <w:r>
+              <w:rPr>
+                <w:b w:val="false"/>
+                <w:bCs w:val="false"/>
+                <w:sz w:val="18"/>
+                <w:szCs w:val="18"/>
+              </w:rPr>
+              <w:t xml:space="preserve">Publish the AlSanidi-MarketingManager agent in Copilot Studio.</w:t>
+            </w:r>
+          </w:p>
+        </w:tc>
+      </w:tr>
+      <w:tr>
+        <w:tc>
+          <w:tcPr>
+            <w:tcW w:type="dxa" w:w="500"/>
+            <w:tcBorders>
+              <w:top w:val="single" w:color="BFBFBF" w:sz="4"/>
+              <w:left w:val="single" w:color="BFBFBF" w:sz="4"/>
+              <w:bottom w:val="single" w:color="BFBFBF" w:sz="4"/>
+              <w:right w:val="single" w:color="BFBFBF" w:sz="4"/>
+            </w:tcBorders>
+            <w:tcMar>
+              <w:top w:type="dxa" w:w="60"/>
+              <w:left w:type="dxa" w:w="100"/>
+              <w:bottom w:type="dxa" w:w="60"/>
+              <w:right w:type="dxa" w:w="100"/>
+            </w:tcMar>
+          </w:tcPr>
+          <w:p>
+            <w:r>
+              <w:rPr>
+                <w:b w:val="false"/>
+                <w:bCs w:val="false"/>
+                <w:sz w:val="18"/>
+                <w:szCs w:val="18"/>
+              </w:rPr>
+              <w:t xml:space="preserve">6</w:t>
+            </w:r>
+          </w:p>
+        </w:tc>
+        <w:tc>
+          <w:tcPr>
+            <w:tcW w:type="dxa" w:w="8526"/>
+            <w:tcBorders>
+              <w:top w:val="single" w:color="BFBFBF" w:sz="4"/>
+              <w:left w:val="single" w:color="BFBFBF" w:sz="4"/>
+              <w:bottom w:val="single" w:color="BFBFBF" w:sz="4"/>
+              <w:right w:val="single" w:color="BFBFBF" w:sz="4"/>
+            </w:tcBorders>
+            <w:tcMar>
+              <w:top w:type="dxa" w:w="60"/>
+              <w:left w:type="dxa" w:w="100"/>
+              <w:bottom w:type="dxa" w:w="60"/>
+              <w:right w:type="dxa" w:w="100"/>
+            </w:tcMar>
+          </w:tcPr>
+          <w:p>
+            <w:r>
+              <w:rPr>
+                <w:b w:val="false"/>
+                <w:bCs w:val="false"/>
+                <w:sz w:val="18"/>
+                <w:szCs w:val="18"/>
+              </w:rPr>
+              <w:t xml:space="preserve">UAT: replace the Meta connection with one that has an access token, so the Meta flows work again.</w:t>
+            </w:r>
+          </w:p>
+        </w:tc>
+      </w:tr>
+    </w:tbl>
     <w:sectPr>
       <w:footerReference w:type="default" r:id="rId7"/>
       <w:pgSz w:w="11906" w:h="16838" w:orient="portrait"/>

</xml_diff>